<commit_message>
Updated Word files content
</commit_message>
<xml_diff>
--- a/docs/escopo-1/AE1.docx
+++ b/docs/escopo-1/AE1.docx
@@ -2163,13 +2163,7 @@
         <w:t xml:space="preserve"> </w:t>
       </w:r>
       <w:r>
-        <w:t>uma das principais formas de acesso ao ensino superior. Os resultados obtidos pelos participantes refletem diversos fatores educacionais, sociais e econômicos, permitindo identificar desigualdades e oportunidades de melhoria no sistema educacional.</w:t>
-      </w:r>
-      <w:r>
-        <w:t xml:space="preserve"> E</w:t>
-      </w:r>
-      <w:r>
-        <w:t>ste projeto busca gerar informações que possam apoiar iniciativas voltadas à melhoria do desempenho estudantil e à redução de desigualdades educacionais no estado de São Paulo.</w:t>
+        <w:t>uma das principais formas de acesso ao ensino superior. Os resultados obtidos pelos participantes refletem diversos fatores educacionais, sociais e econômicos, permitindo identificar desigualdades e oportunidades de melhoria no sistema educacional. Este projeto busca gerar informações que possam apoiar iniciativas voltadas à melhoria do desempenho estudantil e à redução de desigualdades educacionais no estado de São Paulo.</w:t>
       </w:r>
     </w:p>
     <w:p/>
@@ -2266,13 +2260,7 @@
         <w:tab/>
       </w:r>
       <w:r>
-        <w:t xml:space="preserve">Escolas </w:t>
-      </w:r>
-      <w:r>
-        <w:t xml:space="preserve">do </w:t>
-      </w:r>
-      <w:r>
-        <w:t>estado de São Paulo, gestores educacionais, pesquisadores da área de educação e órgãos públicos responsáveis pelo desenvolvimento de políticas voltadas à qualidade da educação.</w:t>
+        <w:t>Escolas do estado de São Paulo, gestores educacionais, pesquisadores da área de educação e órgãos públicos responsáveis pelo desenvolvimento de políticas voltadas à qualidade da educação.</w:t>
       </w:r>
     </w:p>
     <w:p>
@@ -2302,20 +2290,15 @@
     <w:p>
       <w:r>
         <w:tab/>
-      </w:r>
-      <w:r>
-        <w:t>Análise dos microdados do ENEM 2024 referentes aos participantes que realizaram a prova no estado de São Paulo</w:t>
-      </w:r>
-      <w:r>
-        <w:t xml:space="preserve"> e avaliação do desempenho dos participantes nas áreas de conhecimento, geração de indicadores e visualizações de apoio à interpretação de resuldaos.</w:t>
+        <w:t>Análise dos microdados do ENEM 2024 referentes aos participantes que realizaram a prova no estado de São Paulo e avaliação do desempenho dos participantes nas áreas de conhecimento, geração de indicadores e visualizações de apoio à interpretação de resuldaos.</w:t>
       </w:r>
     </w:p>
     <w:p>
       <w:r>
         <w:tab/>
-        <w:t>Não foi possível obter dados de nota de redação dos candidatos inscritos, portanto esse dado estará fora do escopo.</w:t>
-      </w:r>
-    </w:p>
+      </w:r>
+    </w:p>
+    <w:p/>
     <w:p>
       <w:pPr>
         <w:pStyle w:val="Title"/>
@@ -2432,13 +2415,7 @@
     </w:p>
     <w:p>
       <w:r>
-        <w:t>O projeto será considerado bem-sucedido se for capaz de processar os microdados</w:t>
-      </w:r>
-      <w:r>
-        <w:t xml:space="preserve"> </w:t>
-      </w:r>
-      <w:r>
-        <w:t>gerar os indicadores definidos e responder às perguntas analíticas propostas por meio de visualizações e análises claras, produzindo informações úteis para a compreensão do desempenho educacional dos participantes.</w:t>
+        <w:t>O projeto será considerado bem-sucedido se for capaz de processar os microdados gerar os indicadores definidos e responder às perguntas analíticas propostas por meio de visualizações e análises claras, produzindo informações úteis para a compreensão do desempenho educacional dos participantes.</w:t>
       </w:r>
     </w:p>
     <w:p/>
@@ -2462,13 +2439,7 @@
           <w:rPr>
             <w:rStyle w:val="Hyperlink"/>
           </w:rPr>
-          <w:t>https://www.gov.br/inep/pt-br/acesso-a-informacao/dados-abertos/microdados/enem</w:t>
-        </w:r>
-        <w:r>
-          <w:rPr>
-            <w:rStyle w:val="Hyperlink"/>
-          </w:rPr>
-          <w:t xml:space="preserve"> no ano de 2024</w:t>
+          <w:t>https://www.gov.br/inep/pt-br/acesso-a-informacao/dados-abertos/microdados/enem no ano de 2024</w:t>
         </w:r>
       </w:hyperlink>
     </w:p>
@@ -2480,13 +2451,7 @@
       </w:pPr>
       <w:bookmarkStart w:id="9" w:name="_Toc231726333"/>
       <w:r>
-        <w:t>9</w:t>
-      </w:r>
-      <w:r>
-        <w:t xml:space="preserve"> </w:t>
-      </w:r>
-      <w:r>
-        <w:t>ASPECTOS ÉTICOS/LGP</w:t>
+        <w:t>9 ASPECTOS ÉTICOS/LGP</w:t>
       </w:r>
       <w:r>
         <w:t>D</w:t>
@@ -2498,10 +2463,7 @@
         <w:ind w:firstLine="708"/>
       </w:pPr>
       <w:r>
-        <w:t>O projeto utilizará apenas dados públicos disponibilizados pelo INEP, sem acesso a informações que permitam identificar diretamente os participantes.</w:t>
-      </w:r>
-      <w:r>
-        <w:t xml:space="preserve"> Os dados serão analisados de forma que respeitem os princípios da Lei Geral de Proteção de Dados.</w:t>
+        <w:t>O projeto utilizará apenas dados públicos disponibilizados pelo INEP, sem acesso a informações que permitam identificar diretamente os participantes. Os dados serão analisados de forma que respeitem os princípios da Lei Geral de Proteção de Dados.</w:t>
       </w:r>
     </w:p>
     <w:p/>
@@ -2512,13 +2474,7 @@
       </w:pPr>
       <w:bookmarkStart w:id="10" w:name="_Toc231726334"/>
       <w:r>
-        <w:t>10</w:t>
-      </w:r>
-      <w:r>
-        <w:t xml:space="preserve"> </w:t>
-      </w:r>
-      <w:r>
-        <w:t>EAP/WBS</w:t>
+        <w:t>10 EAP/WBS</w:t>
       </w:r>
       <w:bookmarkEnd w:id="10"/>
     </w:p>
@@ -3031,16 +2987,7 @@
       </w:pPr>
       <w:bookmarkStart w:id="12" w:name="_Toc231726336"/>
       <w:r>
-        <w:t>1</w:t>
-      </w:r>
-      <w:r>
-        <w:t>2</w:t>
-      </w:r>
-      <w:r>
-        <w:t xml:space="preserve"> </w:t>
-      </w:r>
-      <w:r>
-        <w:t>MATRIZ DE RISCOS</w:t>
+        <w:t>12 MATRIZ DE RISCOS</w:t>
       </w:r>
       <w:bookmarkEnd w:id="12"/>
     </w:p>
@@ -3318,10 +3265,7 @@
       </w:pPr>
       <w:bookmarkStart w:id="13" w:name="_Toc231726337"/>
       <w:r>
-        <w:t xml:space="preserve">12 </w:t>
-      </w:r>
-      <w:r>
-        <w:t>LINK GITHUB</w:t>
+        <w:t>12 LINK GITHUB</w:t>
       </w:r>
       <w:bookmarkEnd w:id="13"/>
     </w:p>

</xml_diff>